<commit_message>
Use "Deliver every X weeks" verbatim from Loop everywhere
Reverts the cart-drawer .replace() that swapped Loop's plan name to
"Ships every X weeks". The frequency_label values on pack_option blocks
are also realigned to match the Loop-issued name verbatim, so PDP and
cart show the same wording without any string manipulation.

Schema info hint and bilingual docs updated accordingly. PDF / DOCX /
HTML regenerated.

Co-Authored-By: Claude Opus 4.7 (1M context) <noreply@anthropic.com>
</commit_message>
<xml_diff>
--- a/docs/cart-discount-logic.docx
+++ b/docs/cart-discount-logic.docx
@@ -1375,7 +1375,7 @@
         <w:t xml:space="preserve"> </w:t>
       </w:r>
       <w:r>
-        <w:t xml:space="preserve">“Ships every 4 weeks”</w:t>
+        <w:t xml:space="preserve">“Deliver every 4 weeks”</w:t>
       </w:r>
       <w:r>
         <w:t xml:space="preserve">)</w:t>
@@ -2638,7 +2638,7 @@
         <w:t xml:space="preserve"> </w:t>
       </w:r>
       <w:r>
-        <w:t xml:space="preserve">“Ships every 14 weeks”</w:t>
+        <w:t xml:space="preserve">“Deliver every 14 weeks”</w:t>
       </w:r>
       <w:r>
         <w:t xml:space="preserve"> </w:t>

</xml_diff>